<commit_message>
Update title placeholder to titleeeeee...
</commit_message>
<xml_diff>
--- a/template.docx
+++ b/template.docx
@@ -228,6 +228,7 @@
           </mc:Fallback>
         </mc:AlternateContent>
       </w:r>
+      <w:proofErr w:type="gramStart"/>
       <w:r>
         <w:rPr>
           <w:rFonts w:ascii="Times New Roman" w:hAnsi="Times New Roman" w:cs="Times New Roman"/>
@@ -250,7 +251,16 @@
           <w:sz w:val="24"/>
           <w:szCs w:val="28"/>
         </w:rPr>
-        <w:t>{{subject}}</w:t>
+        <w:t>{</w:t>
+      </w:r>
+      <w:proofErr w:type="gramEnd"/>
+      <w:r>
+        <w:rPr>
+          <w:rFonts w:ascii="Times New Roman" w:hAnsi="Times New Roman" w:cs="Times New Roman"/>
+          <w:sz w:val="24"/>
+          <w:szCs w:val="28"/>
+        </w:rPr>
+        <w:t>{subject}}</w:t>
       </w:r>
     </w:p>
     <w:p>
@@ -403,6 +413,7 @@
           </mc:Fallback>
         </mc:AlternateContent>
       </w:r>
+      <w:proofErr w:type="gramStart"/>
       <w:r>
         <w:rPr>
           <w:rFonts w:ascii="Times New Roman" w:hAnsi="Times New Roman" w:cs="Times New Roman"/>
@@ -417,15 +428,42 @@
           <w:sz w:val="24"/>
           <w:szCs w:val="28"/>
         </w:rPr>
-        <w:t>{{pen}}</w:t>
-      </w:r>
-      <w:r>
-        <w:rPr>
-          <w:rFonts w:ascii="Times New Roman" w:hAnsi="Times New Roman" w:cs="Times New Roman"/>
-          <w:sz w:val="24"/>
-          <w:szCs w:val="28"/>
-        </w:rPr>
-        <w:t xml:space="preserve">                                                                             </w:t>
+        <w:t>{</w:t>
+      </w:r>
+      <w:proofErr w:type="gramEnd"/>
+      <w:r>
+        <w:rPr>
+          <w:rFonts w:ascii="Times New Roman" w:hAnsi="Times New Roman" w:cs="Times New Roman"/>
+          <w:sz w:val="24"/>
+          <w:szCs w:val="28"/>
+        </w:rPr>
+        <w:t>{pen</w:t>
+      </w:r>
+      <w:proofErr w:type="gramStart"/>
+      <w:r>
+        <w:rPr>
+          <w:rFonts w:ascii="Times New Roman" w:hAnsi="Times New Roman" w:cs="Times New Roman"/>
+          <w:sz w:val="24"/>
+          <w:szCs w:val="28"/>
+        </w:rPr>
+        <w:t>}}</w:t>
+      </w:r>
+      <w:r>
+        <w:rPr>
+          <w:rFonts w:ascii="Times New Roman" w:hAnsi="Times New Roman" w:cs="Times New Roman"/>
+          <w:sz w:val="24"/>
+          <w:szCs w:val="28"/>
+        </w:rPr>
+        <w:t xml:space="preserve">   </w:t>
+      </w:r>
+      <w:proofErr w:type="gramEnd"/>
+      <w:r>
+        <w:rPr>
+          <w:rFonts w:ascii="Times New Roman" w:hAnsi="Times New Roman" w:cs="Times New Roman"/>
+          <w:sz w:val="24"/>
+          <w:szCs w:val="28"/>
+        </w:rPr>
+        <w:t xml:space="preserve">                                                                          </w:t>
       </w:r>
       <w:r>
         <w:rPr>
@@ -543,15 +581,33 @@
           <w:sz w:val="24"/>
           <w:szCs w:val="28"/>
         </w:rPr>
-        <w:t>Name of Student:</w:t>
-      </w:r>
-      <w:r>
-        <w:rPr>
-          <w:rFonts w:ascii="Times New Roman" w:hAnsi="Times New Roman" w:cs="Times New Roman"/>
-          <w:sz w:val="24"/>
-          <w:szCs w:val="28"/>
-        </w:rPr>
-        <w:t>{{name}}</w:t>
+        <w:t xml:space="preserve">Name of </w:t>
+      </w:r>
+      <w:proofErr w:type="gramStart"/>
+      <w:r>
+        <w:rPr>
+          <w:rFonts w:ascii="Times New Roman" w:hAnsi="Times New Roman" w:cs="Times New Roman"/>
+          <w:sz w:val="24"/>
+          <w:szCs w:val="28"/>
+        </w:rPr>
+        <w:t>Student:</w:t>
+      </w:r>
+      <w:r>
+        <w:rPr>
+          <w:rFonts w:ascii="Times New Roman" w:hAnsi="Times New Roman" w:cs="Times New Roman"/>
+          <w:sz w:val="24"/>
+          <w:szCs w:val="28"/>
+        </w:rPr>
+        <w:t>{</w:t>
+      </w:r>
+      <w:proofErr w:type="gramEnd"/>
+      <w:r>
+        <w:rPr>
+          <w:rFonts w:ascii="Times New Roman" w:hAnsi="Times New Roman" w:cs="Times New Roman"/>
+          <w:sz w:val="24"/>
+          <w:szCs w:val="28"/>
+        </w:rPr>
+        <w:t>{name}}</w:t>
       </w:r>
       <w:r>
         <w:rPr>
@@ -708,6 +764,7 @@
           </mc:Fallback>
         </mc:AlternateContent>
       </w:r>
+      <w:proofErr w:type="gramStart"/>
       <w:r>
         <w:rPr>
           <w:rFonts w:ascii="Times New Roman" w:hAnsi="Times New Roman" w:cs="Times New Roman"/>
@@ -720,10 +777,28 @@
         <w:rPr>
           <w:rFonts w:ascii="Times New Roman" w:hAnsi="Times New Roman" w:cs="Times New Roman"/>
         </w:rPr>
-        <w:t>{{class}}</w:t>
-      </w:r>
-      <w:r>
-        <w:t xml:space="preserve">                              </w:t>
+        <w:t>{</w:t>
+      </w:r>
+      <w:proofErr w:type="gramEnd"/>
+      <w:r>
+        <w:rPr>
+          <w:rFonts w:ascii="Times New Roman" w:hAnsi="Times New Roman" w:cs="Times New Roman"/>
+        </w:rPr>
+        <w:t>{class</w:t>
+      </w:r>
+      <w:proofErr w:type="gramStart"/>
+      <w:r>
+        <w:rPr>
+          <w:rFonts w:ascii="Times New Roman" w:hAnsi="Times New Roman" w:cs="Times New Roman"/>
+        </w:rPr>
+        <w:t>}}</w:t>
+      </w:r>
+      <w:r>
+        <w:t xml:space="preserve">   </w:t>
+      </w:r>
+      <w:proofErr w:type="gramEnd"/>
+      <w:r>
+        <w:t xml:space="preserve">                           </w:t>
       </w:r>
       <w:r>
         <w:t xml:space="preserve">  </w:t>
@@ -766,14 +841,82 @@
         <w:tabs>
           <w:tab w:val="left" w:pos="8253"/>
         </w:tabs>
-        <w:ind w:right="2495"/>
         <w:mirrorIndents/>
         <w:rPr>
           <w:rFonts w:ascii="Times New Roman" w:hAnsi="Times New Roman" w:cs="Times New Roman"/>
-          <w:sz w:val="24"/>
-          <w:szCs w:val="28"/>
+          <w:noProof/>
         </w:rPr>
       </w:pPr>
+      <w:r>
+        <w:rPr>
+          <w:noProof/>
+        </w:rPr>
+        <mc:AlternateContent>
+          <mc:Choice Requires="wps">
+            <w:drawing>
+              <wp:anchor distT="0" distB="0" distL="114300" distR="114300" simplePos="0" relativeHeight="251673600" behindDoc="1" locked="0" layoutInCell="1" allowOverlap="1" wp14:anchorId="6C9D6F46" wp14:editId="3BB83C86">
+                <wp:simplePos x="0" y="0"/>
+                <wp:positionH relativeFrom="column">
+                  <wp:posOffset>0</wp:posOffset>
+                </wp:positionH>
+                <wp:positionV relativeFrom="page">
+                  <wp:posOffset>4719283</wp:posOffset>
+                </wp:positionV>
+                <wp:extent cx="5734050" cy="0"/>
+                <wp:effectExtent l="0" t="0" r="0" b="0"/>
+                <wp:wrapNone/>
+                <wp:docPr id="169549380" name="Straight Connector 1"/>
+                <wp:cNvGraphicFramePr/>
+                <a:graphic xmlns:a="http://schemas.openxmlformats.org/drawingml/2006/main">
+                  <a:graphicData uri="http://schemas.microsoft.com/office/word/2010/wordprocessingShape">
+                    <wps:wsp>
+                      <wps:cNvCnPr/>
+                      <wps:spPr>
+                        <a:xfrm flipV="1">
+                          <a:off x="0" y="0"/>
+                          <a:ext cx="5734050" cy="0"/>
+                        </a:xfrm>
+                        <a:prstGeom prst="line">
+                          <a:avLst/>
+                        </a:prstGeom>
+                      </wps:spPr>
+                      <wps:style>
+                        <a:lnRef idx="1">
+                          <a:schemeClr val="dk1"/>
+                        </a:lnRef>
+                        <a:fillRef idx="0">
+                          <a:schemeClr val="dk1"/>
+                        </a:fillRef>
+                        <a:effectRef idx="0">
+                          <a:schemeClr val="dk1"/>
+                        </a:effectRef>
+                        <a:fontRef idx="minor">
+                          <a:schemeClr val="tx1"/>
+                        </a:fontRef>
+                      </wps:style>
+                      <wps:bodyPr/>
+                    </wps:wsp>
+                  </a:graphicData>
+                </a:graphic>
+                <wp14:sizeRelH relativeFrom="margin">
+                  <wp14:pctWidth>0</wp14:pctWidth>
+                </wp14:sizeRelH>
+                <wp14:sizeRelV relativeFrom="margin">
+                  <wp14:pctHeight>0</wp14:pctHeight>
+                </wp14:sizeRelV>
+              </wp:anchor>
+            </w:drawing>
+          </mc:Choice>
+          <mc:Fallback>
+            <w:pict>
+              <v:line w14:anchorId="18C81214" id="Straight Connector 1" o:spid="_x0000_s1026" style="position:absolute;flip:y;z-index:-251642880;visibility:visible;mso-wrap-style:square;mso-width-percent:0;mso-height-percent:0;mso-wrap-distance-left:9pt;mso-wrap-distance-top:0;mso-wrap-distance-right:9pt;mso-wrap-distance-bottom:0;mso-position-horizontal:absolute;mso-position-horizontal-relative:text;mso-position-vertical:absolute;mso-position-vertical-relative:page;mso-width-percent:0;mso-height-percent:0;mso-width-relative:margin;mso-height-relative:margin" from="0,371.6pt" to="451.5pt,371.6pt" o:gfxdata="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" strokecolor="black [3200]" strokeweight=".5pt">
+                <v:stroke joinstyle="miter"/>
+                <w10:wrap anchory="page"/>
+              </v:line>
+            </w:pict>
+          </mc:Fallback>
+        </mc:AlternateContent>
+      </w:r>
       <w:r>
         <w:rPr>
           <w:noProof/>
@@ -850,13 +993,153 @@
           <w:sz w:val="24"/>
           <w:szCs w:val="28"/>
         </w:rPr>
-        <w:t>Name of Experiment / Title of Term Work:</w:t>
-      </w:r>
-      <w:r>
-        <w:rPr>
-          <w:rFonts w:ascii="Times New Roman" w:hAnsi="Times New Roman" w:cs="Times New Roman"/>
-        </w:rPr>
-        <w:t>{{title}}</w:t>
+        <w:t>Name</w:t>
+      </w:r>
+      <w:r>
+        <w:rPr>
+          <w:rFonts w:ascii="Times New Roman" w:hAnsi="Times New Roman" w:cs="Times New Roman"/>
+          <w:sz w:val="24"/>
+          <w:szCs w:val="28"/>
+        </w:rPr>
+        <w:t>‎</w:t>
+      </w:r>
+      <w:r>
+        <w:rPr>
+          <w:rFonts w:ascii="Times New Roman" w:eastAsia="Malgun Gothic" w:hAnsi="Times New Roman" w:cs="Times New Roman"/>
+          <w:sz w:val="6"/>
+          <w:szCs w:val="8"/>
+        </w:rPr>
+        <w:t>ㅤ</w:t>
+      </w:r>
+      <w:r>
+        <w:rPr>
+          <w:rFonts w:ascii="Times New Roman" w:hAnsi="Times New Roman" w:cs="Times New Roman"/>
+          <w:sz w:val="24"/>
+          <w:szCs w:val="28"/>
+        </w:rPr>
+        <w:t>of</w:t>
+      </w:r>
+      <w:r>
+        <w:rPr>
+          <w:rFonts w:ascii="Times New Roman" w:eastAsia="Malgun Gothic" w:hAnsi="Times New Roman" w:cs="Times New Roman"/>
+          <w:sz w:val="6"/>
+          <w:szCs w:val="8"/>
+        </w:rPr>
+        <w:t>ㅤ</w:t>
+      </w:r>
+      <w:r>
+        <w:rPr>
+          <w:rFonts w:ascii="Times New Roman" w:hAnsi="Times New Roman" w:cs="Times New Roman"/>
+          <w:sz w:val="24"/>
+          <w:szCs w:val="28"/>
+        </w:rPr>
+        <w:t>Experiment</w:t>
+      </w:r>
+      <w:r>
+        <w:rPr>
+          <w:rFonts w:ascii="Times New Roman" w:eastAsia="Malgun Gothic" w:hAnsi="Times New Roman" w:cs="Times New Roman"/>
+          <w:sz w:val="6"/>
+          <w:szCs w:val="8"/>
+        </w:rPr>
+        <w:t>ㅤ</w:t>
+      </w:r>
+      <w:r>
+        <w:rPr>
+          <w:rFonts w:ascii="Times New Roman" w:hAnsi="Times New Roman" w:cs="Times New Roman"/>
+          <w:sz w:val="24"/>
+          <w:szCs w:val="28"/>
+        </w:rPr>
+        <w:t>/</w:t>
+      </w:r>
+      <w:r>
+        <w:rPr>
+          <w:rFonts w:ascii="Times New Roman" w:eastAsia="Malgun Gothic" w:hAnsi="Times New Roman" w:cs="Times New Roman"/>
+          <w:sz w:val="6"/>
+          <w:szCs w:val="8"/>
+        </w:rPr>
+        <w:t>ㅤ</w:t>
+      </w:r>
+      <w:r>
+        <w:rPr>
+          <w:rFonts w:ascii="Times New Roman" w:hAnsi="Times New Roman" w:cs="Times New Roman"/>
+          <w:sz w:val="24"/>
+          <w:szCs w:val="28"/>
+        </w:rPr>
+        <w:t>Title</w:t>
+      </w:r>
+      <w:r>
+        <w:rPr>
+          <w:rFonts w:ascii="Times New Roman" w:eastAsia="Malgun Gothic" w:hAnsi="Times New Roman" w:cs="Times New Roman"/>
+          <w:sz w:val="6"/>
+          <w:szCs w:val="8"/>
+        </w:rPr>
+        <w:t>ㅤ</w:t>
+      </w:r>
+      <w:r>
+        <w:rPr>
+          <w:rFonts w:ascii="Times New Roman" w:hAnsi="Times New Roman" w:cs="Times New Roman"/>
+          <w:sz w:val="24"/>
+          <w:szCs w:val="28"/>
+        </w:rPr>
+        <w:t>of</w:t>
+      </w:r>
+      <w:r>
+        <w:rPr>
+          <w:rFonts w:ascii="Times New Roman" w:eastAsia="Malgun Gothic" w:hAnsi="Times New Roman" w:cs="Times New Roman"/>
+          <w:sz w:val="6"/>
+          <w:szCs w:val="8"/>
+        </w:rPr>
+        <w:t>ㅤ</w:t>
+      </w:r>
+      <w:r>
+        <w:rPr>
+          <w:rFonts w:ascii="Times New Roman" w:hAnsi="Times New Roman" w:cs="Times New Roman"/>
+          <w:sz w:val="24"/>
+          <w:szCs w:val="28"/>
+        </w:rPr>
+        <w:t>Term</w:t>
+      </w:r>
+      <w:r>
+        <w:rPr>
+          <w:rFonts w:ascii="Times New Roman" w:eastAsia="Malgun Gothic" w:hAnsi="Times New Roman" w:cs="Times New Roman"/>
+          <w:sz w:val="6"/>
+          <w:szCs w:val="8"/>
+        </w:rPr>
+        <w:t>ㅤ</w:t>
+      </w:r>
+      <w:proofErr w:type="gramStart"/>
+      <w:r>
+        <w:rPr>
+          <w:rFonts w:ascii="Times New Roman" w:hAnsi="Times New Roman" w:cs="Times New Roman"/>
+          <w:sz w:val="24"/>
+          <w:szCs w:val="28"/>
+        </w:rPr>
+        <w:t>Work:</w:t>
+      </w:r>
+      <w:r>
+        <w:rPr>
+          <w:rFonts w:ascii="Times New Roman" w:hAnsi="Times New Roman" w:cs="Times New Roman"/>
+        </w:rPr>
+        <w:t>{</w:t>
+      </w:r>
+      <w:proofErr w:type="gramEnd"/>
+      <w:r>
+        <w:rPr>
+          <w:rFonts w:ascii="Times New Roman" w:hAnsi="Times New Roman" w:cs="Times New Roman"/>
+        </w:rPr>
+        <w:t>{title</w:t>
+      </w:r>
+      <w:r>
+        <w:rPr>
+          <w:rFonts w:ascii="Times New Roman" w:hAnsi="Times New Roman" w:cs="Times New Roman"/>
+        </w:rPr>
+        <w:t>eeeeeeeeeeeeeeeeeeeeeeeeeeeeeeeeeeeeeeeeeeeeeeeeeeeeeeeeeeeeeeeeeeeeeeeeeeeeeeeeeeeeeeeeeeeeeeeeeeeeeeeeeeeeeeeeeeeeeeeeeeeee</w:t>
+      </w:r>
+      <w:r>
+        <w:rPr>
+          <w:rFonts w:ascii="Times New Roman" w:hAnsi="Times New Roman" w:cs="Times New Roman"/>
+        </w:rPr>
+        <w:t>}}</w:t>
       </w:r>
       <w:r>
         <w:rPr>
@@ -880,76 +1163,6 @@
       </w:pPr>
       <w:r>
         <w:rPr>
-          <w:noProof/>
-        </w:rPr>
-        <mc:AlternateContent>
-          <mc:Choice Requires="wps">
-            <w:drawing>
-              <wp:anchor distT="0" distB="0" distL="114300" distR="114300" simplePos="0" relativeHeight="251673600" behindDoc="1" locked="0" layoutInCell="1" allowOverlap="1" wp14:anchorId="6C9D6F46" wp14:editId="0073901E">
-                <wp:simplePos x="0" y="0"/>
-                <wp:positionH relativeFrom="column">
-                  <wp:posOffset>0</wp:posOffset>
-                </wp:positionH>
-                <wp:positionV relativeFrom="page">
-                  <wp:posOffset>4805363</wp:posOffset>
-                </wp:positionV>
-                <wp:extent cx="5734368" cy="0"/>
-                <wp:effectExtent l="0" t="0" r="0" b="0"/>
-                <wp:wrapNone/>
-                <wp:docPr id="169549380" name="Straight Connector 1"/>
-                <wp:cNvGraphicFramePr/>
-                <a:graphic xmlns:a="http://schemas.openxmlformats.org/drawingml/2006/main">
-                  <a:graphicData uri="http://schemas.microsoft.com/office/word/2010/wordprocessingShape">
-                    <wps:wsp>
-                      <wps:cNvCnPr/>
-                      <wps:spPr>
-                        <a:xfrm flipV="1">
-                          <a:off x="0" y="0"/>
-                          <a:ext cx="5734368" cy="0"/>
-                        </a:xfrm>
-                        <a:prstGeom prst="line">
-                          <a:avLst/>
-                        </a:prstGeom>
-                      </wps:spPr>
-                      <wps:style>
-                        <a:lnRef idx="1">
-                          <a:schemeClr val="dk1"/>
-                        </a:lnRef>
-                        <a:fillRef idx="0">
-                          <a:schemeClr val="dk1"/>
-                        </a:fillRef>
-                        <a:effectRef idx="0">
-                          <a:schemeClr val="dk1"/>
-                        </a:effectRef>
-                        <a:fontRef idx="minor">
-                          <a:schemeClr val="tx1"/>
-                        </a:fontRef>
-                      </wps:style>
-                      <wps:bodyPr/>
-                    </wps:wsp>
-                  </a:graphicData>
-                </a:graphic>
-                <wp14:sizeRelH relativeFrom="margin">
-                  <wp14:pctWidth>0</wp14:pctWidth>
-                </wp14:sizeRelH>
-                <wp14:sizeRelV relativeFrom="margin">
-                  <wp14:pctHeight>0</wp14:pctHeight>
-                </wp14:sizeRelV>
-              </wp:anchor>
-            </w:drawing>
-          </mc:Choice>
-          <mc:Fallback>
-            <w:pict>
-              <v:line w14:anchorId="79F0497D" id="Straight Connector 1" o:spid="_x0000_s1026" style="position:absolute;flip:y;z-index:-251642880;visibility:visible;mso-wrap-style:square;mso-width-percent:0;mso-height-percent:0;mso-wrap-distance-left:9pt;mso-wrap-distance-top:0;mso-wrap-distance-right:9pt;mso-wrap-distance-bottom:0;mso-position-horizontal:absolute;mso-position-horizontal-relative:text;mso-position-vertical:absolute;mso-position-vertical-relative:page;mso-width-percent:0;mso-height-percent:0;mso-width-relative:margin;mso-height-relative:margin" from="0,378.4pt" to="451.55pt,378.4pt" o:gfxdata="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" strokecolor="black [3200]" strokeweight=".5pt">
-                <v:stroke joinstyle="miter"/>
-                <w10:wrap anchory="page"/>
-              </v:line>
-            </w:pict>
-          </mc:Fallback>
-        </mc:AlternateContent>
-      </w:r>
-      <w:r>
-        <w:rPr>
           <w:rFonts w:ascii="Times New Roman" w:hAnsi="Times New Roman" w:cs="Times New Roman"/>
           <w:sz w:val="24"/>
           <w:szCs w:val="28"/>
@@ -976,18 +1189,6 @@
           <w:szCs w:val="28"/>
         </w:rPr>
       </w:pPr>
-    </w:p>
-    <w:p>
-      <w:pPr>
-        <w:tabs>
-          <w:tab w:val="left" w:pos="8253"/>
-        </w:tabs>
-        <w:rPr>
-          <w:rFonts w:ascii="Times New Roman" w:hAnsi="Times New Roman" w:cs="Times New Roman"/>
-          <w:sz w:val="24"/>
-          <w:szCs w:val="28"/>
-        </w:rPr>
-      </w:pPr>
       <w:r>
         <w:rPr>
           <w:noProof/>
@@ -995,13 +1196,13 @@
         <mc:AlternateContent>
           <mc:Choice Requires="wps">
             <w:drawing>
-              <wp:anchor distT="0" distB="0" distL="114300" distR="114300" simplePos="0" relativeHeight="251675648" behindDoc="1" locked="0" layoutInCell="1" allowOverlap="1" wp14:anchorId="07106BD8" wp14:editId="02A10742">
+              <wp:anchor distT="0" distB="0" distL="114300" distR="114300" simplePos="0" relativeHeight="251675648" behindDoc="1" locked="0" layoutInCell="1" allowOverlap="1" wp14:anchorId="07106BD8" wp14:editId="71671B85">
                 <wp:simplePos x="0" y="0"/>
                 <wp:positionH relativeFrom="column">
                   <wp:posOffset>4547870</wp:posOffset>
                 </wp:positionH>
                 <wp:positionV relativeFrom="page">
-                  <wp:posOffset>5390833</wp:posOffset>
+                  <wp:posOffset>5279707</wp:posOffset>
                 </wp:positionV>
                 <wp:extent cx="1155452" cy="0"/>
                 <wp:effectExtent l="0" t="0" r="0" b="0"/>
@@ -1050,7 +1251,7 @@
           </mc:Choice>
           <mc:Fallback>
             <w:pict>
-              <v:line w14:anchorId="68737DEC" id="Straight Connector 1" o:spid="_x0000_s1026" style="position:absolute;flip:y;z-index:-251640832;visibility:visible;mso-wrap-style:square;mso-width-percent:0;mso-height-percent:0;mso-wrap-distance-left:9pt;mso-wrap-distance-top:0;mso-wrap-distance-right:9pt;mso-wrap-distance-bottom:0;mso-position-horizontal:absolute;mso-position-horizontal-relative:text;mso-position-vertical:absolute;mso-position-vertical-relative:page;mso-width-percent:0;mso-height-percent:0;mso-width-relative:margin;mso-height-relative:margin" from="358.1pt,424.5pt" to="449.1pt,424.5pt" o:gfxdata="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" strokecolor="black [3200]" strokeweight=".5pt">
+              <v:line w14:anchorId="3FF9C3A4" id="Straight Connector 1" o:spid="_x0000_s1026" style="position:absolute;flip:y;z-index:-251640832;visibility:visible;mso-wrap-style:square;mso-width-percent:0;mso-height-percent:0;mso-wrap-distance-left:9pt;mso-wrap-distance-top:0;mso-wrap-distance-right:9pt;mso-wrap-distance-bottom:0;mso-position-horizontal:absolute;mso-position-horizontal-relative:text;mso-position-vertical:absolute;mso-position-vertical-relative:page;mso-width-percent:0;mso-height-percent:0;mso-width-relative:margin;mso-height-relative:margin" from="358.1pt,415.7pt" to="449.1pt,415.7pt" o:gfxdata="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" strokecolor="black [3200]" strokeweight=".5pt">
                 <v:stroke joinstyle="miter"/>
                 <w10:wrap anchory="page"/>
               </v:line>
@@ -1646,15 +1847,15 @@
         <mc:AlternateContent>
           <mc:Choice Requires="wps">
             <w:drawing>
-              <wp:anchor distT="0" distB="0" distL="114300" distR="114300" simplePos="0" relativeHeight="251677696" behindDoc="1" locked="0" layoutInCell="1" allowOverlap="1" wp14:anchorId="4785913C" wp14:editId="5ED87DA2">
+              <wp:anchor distT="0" distB="0" distL="114300" distR="114300" simplePos="0" relativeHeight="251677696" behindDoc="1" locked="0" layoutInCell="1" allowOverlap="1" wp14:anchorId="4785913C" wp14:editId="44E890C7">
                 <wp:simplePos x="0" y="0"/>
                 <wp:positionH relativeFrom="column">
                   <wp:posOffset>759460</wp:posOffset>
                 </wp:positionH>
                 <wp:positionV relativeFrom="page">
-                  <wp:posOffset>7154862</wp:posOffset>
+                  <wp:posOffset>7038693</wp:posOffset>
                 </wp:positionV>
-                <wp:extent cx="4965746" cy="306"/>
+                <wp:extent cx="4965700" cy="0"/>
                 <wp:effectExtent l="0" t="0" r="0" b="0"/>
                 <wp:wrapNone/>
                 <wp:docPr id="1938185207" name="Straight Connector 1"/>
@@ -1666,7 +1867,7 @@
                       <wps:spPr>
                         <a:xfrm>
                           <a:off x="0" y="0"/>
-                          <a:ext cx="4965746" cy="306"/>
+                          <a:ext cx="4965700" cy="0"/>
                         </a:xfrm>
                         <a:prstGeom prst="line">
                           <a:avLst/>
@@ -1701,7 +1902,7 @@
           </mc:Choice>
           <mc:Fallback>
             <w:pict>
-              <v:line w14:anchorId="2686832E" id="Straight Connector 1" o:spid="_x0000_s1026" style="position:absolute;z-index:-251638784;visibility:visible;mso-wrap-style:square;mso-width-percent:0;mso-height-percent:0;mso-wrap-distance-left:9pt;mso-wrap-distance-top:0;mso-wrap-distance-right:9pt;mso-wrap-distance-bottom:0;mso-position-horizontal:absolute;mso-position-horizontal-relative:text;mso-position-vertical:absolute;mso-position-vertical-relative:page;mso-width-percent:0;mso-height-percent:0;mso-width-relative:margin;mso-height-relative:margin" from="59.8pt,563.35pt" to="450.8pt,563.35pt" o:gfxdata="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" strokecolor="black [3200]" strokeweight=".5pt">
+              <v:line w14:anchorId="5E93384D" id="Straight Connector 1" o:spid="_x0000_s1026" style="position:absolute;z-index:-251638784;visibility:visible;mso-wrap-style:square;mso-width-percent:0;mso-height-percent:0;mso-wrap-distance-left:9pt;mso-wrap-distance-top:0;mso-wrap-distance-right:9pt;mso-wrap-distance-bottom:0;mso-position-horizontal:absolute;mso-position-horizontal-relative:text;mso-position-vertical:absolute;mso-position-vertical-relative:page;mso-width-percent:0;mso-height-percent:0;mso-width-relative:margin;mso-height-relative:margin" from="59.8pt,554.25pt" to="450.8pt,554.25pt" o:gfxdata="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" strokecolor="black [3200]" strokeweight=".5pt">
                 <v:stroke joinstyle="miter"/>
                 <w10:wrap anchory="page"/>
               </v:line>
@@ -1715,15 +1916,51 @@
           <w:sz w:val="24"/>
           <w:szCs w:val="28"/>
         </w:rPr>
-        <w:t>Checked By:</w:t>
-      </w:r>
-      <w:r>
-        <w:rPr>
-          <w:rFonts w:ascii="Times New Roman" w:hAnsi="Times New Roman" w:cs="Times New Roman"/>
-          <w:sz w:val="24"/>
-          <w:szCs w:val="28"/>
-        </w:rPr>
-        <w:t>{{checked_by}}</w:t>
+        <w:t xml:space="preserve">Checked </w:t>
+      </w:r>
+      <w:proofErr w:type="gramStart"/>
+      <w:r>
+        <w:rPr>
+          <w:rFonts w:ascii="Times New Roman" w:hAnsi="Times New Roman" w:cs="Times New Roman"/>
+          <w:sz w:val="24"/>
+          <w:szCs w:val="28"/>
+        </w:rPr>
+        <w:t>By:</w:t>
+      </w:r>
+      <w:r>
+        <w:rPr>
+          <w:rFonts w:ascii="Times New Roman" w:hAnsi="Times New Roman" w:cs="Times New Roman"/>
+          <w:sz w:val="24"/>
+          <w:szCs w:val="28"/>
+        </w:rPr>
+        <w:t>{</w:t>
+      </w:r>
+      <w:proofErr w:type="gramEnd"/>
+      <w:r>
+        <w:rPr>
+          <w:rFonts w:ascii="Times New Roman" w:hAnsi="Times New Roman" w:cs="Times New Roman"/>
+          <w:sz w:val="24"/>
+          <w:szCs w:val="28"/>
+        </w:rPr>
+        <w:t>{</w:t>
+      </w:r>
+      <w:proofErr w:type="spellStart"/>
+      <w:r>
+        <w:rPr>
+          <w:rFonts w:ascii="Times New Roman" w:hAnsi="Times New Roman" w:cs="Times New Roman"/>
+          <w:sz w:val="24"/>
+          <w:szCs w:val="28"/>
+        </w:rPr>
+        <w:t>checked_by</w:t>
+      </w:r>
+      <w:proofErr w:type="spellEnd"/>
+      <w:r>
+        <w:rPr>
+          <w:rFonts w:ascii="Times New Roman" w:hAnsi="Times New Roman" w:cs="Times New Roman"/>
+          <w:sz w:val="24"/>
+          <w:szCs w:val="28"/>
+        </w:rPr>
+        <w:t>}}</w:t>
       </w:r>
       <w:r>
         <w:rPr>

</xml_diff>

<commit_message>
Add 3-tier template selection based on title length
</commit_message>
<xml_diff>
--- a/template.docx
+++ b/template.docx
@@ -843,6 +843,12 @@
         <w:rPr>
           <w:sz w:val="24"/>
         </w:rPr>
+        <w:t xml:space="preserve"> </w:t>
+      </w:r>
+      <w:r>
+        <w:rPr>
+          <w:sz w:val="24"/>
+        </w:rPr>
         <w:t xml:space="preserve">   </w:t>
       </w:r>
       <w:r>
@@ -1181,7 +1187,21 @@
           <w:rFonts w:ascii="Times New Roman" w:hAnsi="Times New Roman" w:cs="Times New Roman"/>
           <w:sz w:val="24"/>
         </w:rPr>
-        <w:t xml:space="preserve">                                                                                                                                                                                                                </w:t>
+        <w:t xml:space="preserve">                                                                                                  </w:t>
+      </w:r>
+      <w:r>
+        <w:rPr>
+          <w:rFonts w:ascii="Times New Roman" w:hAnsi="Times New Roman" w:cs="Times New Roman"/>
+          <w:sz w:val="24"/>
+        </w:rPr>
+        <w:t xml:space="preserve"> </w:t>
+      </w:r>
+      <w:r>
+        <w:rPr>
+          <w:rFonts w:ascii="Times New Roman" w:hAnsi="Times New Roman" w:cs="Times New Roman"/>
+          <w:sz w:val="24"/>
+        </w:rPr>
+        <w:t xml:space="preserve">                                                                                                             </w:t>
       </w:r>
     </w:p>
     <w:p>

</xml_diff>